<commit_message>
chore: add temporary document for tracking access database environment changes
</commit_message>
<xml_diff>
--- a/envchangestoAcessDB.docx
+++ b/envchangestoAcessDB.docx
@@ -1,6 +1,6 @@
 
 <file path=word/document.xml><?xml version="1.0" encoding="utf-8"?>
-<w:document xmlns:wpc="http://schemas.microsoft.com/office/word/2010/wordprocessingCanvas" xmlns:mc="http://schemas.openxmlformats.org/markup-compatibility/2006" xmlns:o="urn:schemas-microsoft-com:office:office" xmlns:r="http://schemas.openxmlformats.org/officeDocument/2006/relationships" xmlns:m="http://schemas.openxmlformats.org/officeDocument/2006/math" xmlns:v="urn:schemas-microsoft-com:vml" xmlns:wp14="http://schemas.microsoft.com/office/word/2010/wordprocessingDrawing" xmlns:wp="http://schemas.openxmlformats.org/drawingml/2006/wordprocessingDrawing" xmlns:w="http://schemas.openxmlformats.org/wordprocessingml/2006/main" xmlns:w14="http://schemas.microsoft.com/office/word/2010/wordml" xmlns:w10="urn:schemas-microsoft-com:office:word" xmlns:w15="http://schemas.microsoft.com/office/word/2012/wordml" xmlns:wpg="http://schemas.microsoft.com/office/word/2010/wordprocessingGroup" xmlns:wpi="http://schemas.microsoft.com/office/word/2010/wordprocessingInk" xmlns:wne="http://schemas.microsoft.com/office/word/2006/wordml" xmlns:wps="http://schemas.microsoft.com/office/word/2010/wordprocessingShape" xmlns:wpsCustomData="http://www.wps.cn/officeDocument/2013/wpsCustomData" mc:Ignorable="w14 w15 wp14">
+<w:document xmlns:wpc="http://schemas.microsoft.com/office/word/2010/wordprocessingCanvas" xmlns:cx="http://schemas.microsoft.com/office/drawing/2014/chartex" xmlns:cx1="http://schemas.microsoft.com/office/drawing/2015/9/8/chartex" xmlns:cx2="http://schemas.microsoft.com/office/drawing/2015/10/21/chartex" xmlns:cx3="http://schemas.microsoft.com/office/drawing/2016/5/9/chartex" xmlns:cx4="http://schemas.microsoft.com/office/drawing/2016/5/10/chartex" xmlns:cx5="http://schemas.microsoft.com/office/drawing/2016/5/11/chartex" xmlns:cx6="http://schemas.microsoft.com/office/drawing/2016/5/12/chartex" xmlns:cx7="http://schemas.microsoft.com/office/drawing/2016/5/13/chartex" xmlns:cx8="http://schemas.microsoft.com/office/drawing/2016/5/14/chartex" xmlns:mc="http://schemas.openxmlformats.org/markup-compatibility/2006" xmlns:o="urn:schemas-microsoft-com:office:office" xmlns:r="http://schemas.openxmlformats.org/officeDocument/2006/relationships" xmlns:m="http://schemas.openxmlformats.org/officeDocument/2006/math" xmlns:v="urn:schemas-microsoft-com:vml" xmlns:wp14="http://schemas.microsoft.com/office/word/2010/wordprocessingDrawing" xmlns:wp="http://schemas.openxmlformats.org/drawingml/2006/wordprocessingDrawing" xmlns:w="http://schemas.openxmlformats.org/wordprocessingml/2006/main" xmlns:w14="http://schemas.microsoft.com/office/word/2010/wordml" xmlns:w10="urn:schemas-microsoft-com:office:word" xmlns:w15="http://schemas.microsoft.com/office/word/2012/wordml" xmlns:wpg="http://schemas.microsoft.com/office/word/2010/wordprocessingGroup" xmlns:wpi="http://schemas.microsoft.com/office/word/2010/wordprocessingInk" xmlns:wne="http://schemas.microsoft.com/office/word/2006/wordml" xmlns:wps="http://schemas.microsoft.com/office/word/2010/wordprocessingShape" xmlns:wpsCustomData="http://www.wps.cn/officeDocument/2013/wpsCustomData" mc:Ignorable="w14 w15 wp14">
   <w:body>
     <w:p>
       <w:pPr>
@@ -114,15 +114,136 @@
       </w:r>
     </w:p>
     <w:p>
+      <w:pPr>
+        <w:rPr>
+          <w:rFonts w:hint="default"/>
+        </w:rPr>
+      </w:pPr>
       <w:r>
         <w:rPr>
           <w:rFonts w:hint="default"/>
         </w:rPr>
         <w:t>PROD_API_ENDPOINT=https://foundry-backend-jxd0.onrender.com</w:t>
+      </w:r>
+      <w:r>
+        <w:rPr>
+          <w:rFonts w:hint="default"/>
+        </w:rPr>
+        <w:br w:type="textWrapping"/>
+      </w:r>
+      <w:r>
+        <w:rPr>
+          <w:rFonts w:hint="default"/>
+        </w:rPr>
+        <w:br w:type="textWrapping"/>
+      </w:r>
+      <w:r>
+        <w:rPr>
+          <w:rFonts w:hint="default"/>
+        </w:rPr>
+        <w:br w:type="textWrapping"/>
+      </w:r>
+      <w:r>
+        <w:rPr>
+          <w:rFonts w:hint="default"/>
+        </w:rPr>
+        <w:br w:type="textWrapping"/>
+      </w:r>
+      <w:r>
+        <w:rPr>
+          <w:rFonts w:hint="default"/>
+        </w:rPr>
+        <w:t>SECRET_KEY=django-insecure-3sa31bk^0f2iep*l7x@#+ofb=*k^zmhtz13bas5timjycfb&amp;1*</w:t>
+      </w:r>
+    </w:p>
+    <w:p>
+      <w:pPr>
+        <w:rPr>
+          <w:rFonts w:hint="default"/>
+        </w:rPr>
+      </w:pPr>
+      <w:r>
+        <w:rPr>
+          <w:rFonts w:hint="default"/>
+        </w:rPr>
+        <w:t>DEBUG=True</w:t>
+      </w:r>
+    </w:p>
+    <w:p>
+      <w:pPr>
+        <w:rPr>
+          <w:rFonts w:hint="default"/>
+        </w:rPr>
+      </w:pPr>
+    </w:p>
+    <w:p>
+      <w:pPr>
+        <w:rPr>
+          <w:rFonts w:hint="default"/>
+        </w:rPr>
+      </w:pPr>
+      <w:r>
+        <w:rPr>
+          <w:rFonts w:hint="default"/>
+        </w:rPr>
+        <w:t>DB_NAME=castings</w:t>
+      </w:r>
+    </w:p>
+    <w:p>
+      <w:pPr>
+        <w:rPr>
+          <w:rFonts w:hint="default"/>
+        </w:rPr>
+      </w:pPr>
+      <w:r>
+        <w:rPr>
+          <w:rFonts w:hint="default"/>
+        </w:rPr>
+        <w:t>DB_USER=root</w:t>
       </w:r>
       <w:bookmarkStart w:id="0" w:name="_GoBack"/>
       <w:bookmarkEnd w:id="0"/>
     </w:p>
+    <w:p>
+      <w:pPr>
+        <w:rPr>
+          <w:rFonts w:hint="default"/>
+        </w:rPr>
+      </w:pPr>
+      <w:r>
+        <w:rPr>
+          <w:rFonts w:hint="default"/>
+        </w:rPr>
+        <w:t>DB_PASSWORD=Harini@1415</w:t>
+      </w:r>
+    </w:p>
+    <w:p>
+      <w:pPr>
+        <w:rPr>
+          <w:rFonts w:hint="default"/>
+        </w:rPr>
+      </w:pPr>
+      <w:r>
+        <w:rPr>
+          <w:rFonts w:hint="default"/>
+        </w:rPr>
+        <w:t>DB_HOST=localhost</w:t>
+      </w:r>
+    </w:p>
+    <w:p>
+      <w:pPr>
+        <w:rPr>
+          <w:rFonts w:hint="default"/>
+        </w:rPr>
+      </w:pPr>
+      <w:r>
+        <w:rPr>
+          <w:rFonts w:hint="default"/>
+        </w:rPr>
+        <w:t>DB_PORT=3306</w:t>
+      </w:r>
+    </w:p>
+    <w:p/>
     <w:sectPr>
       <w:pgSz w:w="11906" w:h="16838"/>
       <w:pgMar w:top="1440" w:right="1800" w:bottom="1440" w:left="1800" w:header="720" w:footer="720" w:gutter="0"/>

</xml_diff>